<commit_message>
momento II, implementacion del fuego con sonido y movimiento
</commit_message>
<xml_diff>
--- a/Momento II/MOMENTO II.docx
+++ b/Momento II/MOMENTO II.docx
@@ -255,7 +255,43 @@
           <w:sz w:val="24"/>
           <w:szCs w:val="24"/>
         </w:rPr>
-        <w:t xml:space="preserve"> mas adecuados que van mejor con el estilo retro del videojuego, este nivel no va a tener portales; los va a tener el segundo nivel que me pareció mas adecuado debido a la temática de este nivel.</w:t>
+        <w:t xml:space="preserve"> </w:t>
+      </w:r>
+      <w:proofErr w:type="spellStart"/>
+      <w:r>
+        <w:rPr>
+          <w:rFonts w:ascii="Consolas" w:hAnsi="Consolas"/>
+          <w:sz w:val="24"/>
+          <w:szCs w:val="24"/>
+        </w:rPr>
+        <w:t>mas</w:t>
+      </w:r>
+      <w:proofErr w:type="spellEnd"/>
+      <w:r>
+        <w:rPr>
+          <w:rFonts w:ascii="Consolas" w:hAnsi="Consolas"/>
+          <w:sz w:val="24"/>
+          <w:szCs w:val="24"/>
+        </w:rPr>
+        <w:t xml:space="preserve"> adecuados que van mejor con el estilo retro del videojuego, este nivel no va a tener portales; los va a tener el segundo nivel que me pareció </w:t>
+      </w:r>
+      <w:proofErr w:type="spellStart"/>
+      <w:r>
+        <w:rPr>
+          <w:rFonts w:ascii="Consolas" w:hAnsi="Consolas"/>
+          <w:sz w:val="24"/>
+          <w:szCs w:val="24"/>
+        </w:rPr>
+        <w:t>mas</w:t>
+      </w:r>
+      <w:proofErr w:type="spellEnd"/>
+      <w:r>
+        <w:rPr>
+          <w:rFonts w:ascii="Consolas" w:hAnsi="Consolas"/>
+          <w:sz w:val="24"/>
+          <w:szCs w:val="24"/>
+        </w:rPr>
+        <w:t xml:space="preserve"> adecuado debido a la temática de este nivel.</w:t>
       </w:r>
     </w:p>
     <w:p>
@@ -294,18 +330,35 @@
       <w:pPr>
         <w:pStyle w:val="Prrafodelista"/>
         <w:rPr>
+          <w:rFonts w:ascii="Consolas" w:hAnsi="Consolas"/>
+          <w:b/>
+          <w:bCs/>
+          <w:sz w:val="24"/>
+          <w:szCs w:val="24"/>
+        </w:rPr>
+      </w:pPr>
+    </w:p>
+    <w:p>
+      <w:pPr>
+        <w:pStyle w:val="Prrafodelista"/>
+        <w:rPr>
+          <w:rFonts w:ascii="Consolas" w:hAnsi="Consolas"/>
+          <w:b/>
+          <w:bCs/>
+          <w:sz w:val="24"/>
+          <w:szCs w:val="24"/>
+        </w:rPr>
+      </w:pPr>
+      <w:r>
+        <w:rPr>
           <w:noProof/>
         </w:rPr>
-      </w:pPr>
-      <w:r>
-        <w:rPr>
-          <w:noProof/>
-        </w:rPr>
+        <w:lastRenderedPageBreak/>
         <w:drawing>
-          <wp:inline distT="0" distB="0" distL="0" distR="0" wp14:anchorId="745049DC" wp14:editId="472E74CF">
-            <wp:extent cx="3528060" cy="1303624"/>
-            <wp:effectExtent l="0" t="0" r="0" b="0"/>
-            <wp:docPr id="1" name="Imagen 1"/>
+          <wp:inline distT="0" distB="0" distL="0" distR="0" wp14:anchorId="53074364" wp14:editId="79CBFDD8">
+            <wp:extent cx="3733800" cy="1135380"/>
+            <wp:effectExtent l="0" t="0" r="0" b="7620"/>
+            <wp:docPr id="9" name="Imagen 9"/>
             <wp:cNvGraphicFramePr>
               <a:graphicFrameLocks xmlns:a="http://schemas.openxmlformats.org/drawingml/2006/main" noChangeAspect="1"/>
             </wp:cNvGraphicFramePr>
@@ -313,7 +366,7 @@
               <a:graphicData uri="http://schemas.openxmlformats.org/drawingml/2006/picture">
                 <pic:pic xmlns:pic="http://schemas.openxmlformats.org/drawingml/2006/picture">
                   <pic:nvPicPr>
-                    <pic:cNvPr id="0" name="Picture 1"/>
+                    <pic:cNvPr id="0" name="Picture 2"/>
                     <pic:cNvPicPr>
                       <a:picLocks noChangeAspect="1" noChangeArrowheads="1"/>
                     </pic:cNvPicPr>
@@ -334,7 +387,7 @@
                   <pic:spPr bwMode="auto">
                     <a:xfrm>
                       <a:off x="0" y="0"/>
-                      <a:ext cx="3537694" cy="1307184"/>
+                      <a:ext cx="3733800" cy="1135380"/>
                     </a:xfrm>
                     <a:prstGeom prst="rect">
                       <a:avLst/>
@@ -355,10 +408,10 @@
           <w:noProof/>
         </w:rPr>
         <w:drawing>
-          <wp:inline distT="0" distB="0" distL="0" distR="0" wp14:anchorId="05DB9B27" wp14:editId="54DBD313">
-            <wp:extent cx="1828800" cy="2286000"/>
+          <wp:inline distT="0" distB="0" distL="0" distR="0" wp14:anchorId="2A1BCF0F" wp14:editId="60D9D526">
+            <wp:extent cx="2792379" cy="3429000"/>
             <wp:effectExtent l="0" t="0" r="0" b="0"/>
-            <wp:docPr id="3" name="Imagen 3"/>
+            <wp:docPr id="10" name="Imagen 10"/>
             <wp:cNvGraphicFramePr>
               <a:graphicFrameLocks xmlns:a="http://schemas.openxmlformats.org/drawingml/2006/main" noChangeAspect="1"/>
             </wp:cNvGraphicFramePr>
@@ -366,13 +419,13 @@
               <a:graphicData uri="http://schemas.openxmlformats.org/drawingml/2006/picture">
                 <pic:pic xmlns:pic="http://schemas.openxmlformats.org/drawingml/2006/picture">
                   <pic:nvPicPr>
-                    <pic:cNvPr id="0" name="Picture 5"/>
+                    <pic:cNvPr id="0" name="Picture 4"/>
                     <pic:cNvPicPr>
                       <a:picLocks noChangeAspect="1" noChangeArrowheads="1"/>
                     </pic:cNvPicPr>
                   </pic:nvPicPr>
                   <pic:blipFill>
-                    <a:blip r:embed="rId6">
+                    <a:blip r:embed="rId6" cstate="print">
                       <a:extLst>
                         <a:ext uri="{28A0092B-C50C-407E-A947-70E740481C1C}">
                           <a14:useLocalDpi xmlns:a14="http://schemas.microsoft.com/office/drawing/2010/main" val="0"/>
@@ -387,7 +440,7 @@
                   <pic:spPr bwMode="auto">
                     <a:xfrm>
                       <a:off x="0" y="0"/>
-                      <a:ext cx="1828800" cy="2286000"/>
+                      <a:ext cx="2804092" cy="3443384"/>
                     </a:xfrm>
                     <a:prstGeom prst="rect">
                       <a:avLst/>
@@ -408,6 +461,14 @@
       <w:pPr>
         <w:pStyle w:val="Prrafodelista"/>
         <w:rPr>
+          <w:noProof/>
+        </w:rPr>
+      </w:pPr>
+    </w:p>
+    <w:p>
+      <w:pPr>
+        <w:pStyle w:val="Prrafodelista"/>
+        <w:rPr>
           <w:rFonts w:ascii="Consolas" w:hAnsi="Consolas"/>
           <w:b/>
           <w:bCs/>
@@ -419,12 +480,11 @@
         <w:rPr>
           <w:noProof/>
         </w:rPr>
-        <w:lastRenderedPageBreak/>
         <w:drawing>
-          <wp:inline distT="0" distB="0" distL="0" distR="0" wp14:anchorId="5C43F4A7" wp14:editId="360D8123">
-            <wp:extent cx="2712720" cy="2728583"/>
-            <wp:effectExtent l="0" t="0" r="0" b="0"/>
-            <wp:docPr id="2" name="Imagen 2"/>
+          <wp:inline distT="0" distB="0" distL="0" distR="0" wp14:anchorId="02E47282" wp14:editId="2816EE9A">
+            <wp:extent cx="4015740" cy="1970222"/>
+            <wp:effectExtent l="0" t="0" r="3810" b="0"/>
+            <wp:docPr id="11" name="Imagen 11"/>
             <wp:cNvGraphicFramePr>
               <a:graphicFrameLocks xmlns:a="http://schemas.openxmlformats.org/drawingml/2006/main" noChangeAspect="1"/>
             </wp:cNvGraphicFramePr>
@@ -432,7 +492,7 @@
               <a:graphicData uri="http://schemas.openxmlformats.org/drawingml/2006/picture">
                 <pic:pic xmlns:pic="http://schemas.openxmlformats.org/drawingml/2006/picture">
                   <pic:nvPicPr>
-                    <pic:cNvPr id="0" name="Picture 3"/>
+                    <pic:cNvPr id="0" name="Picture 6"/>
                     <pic:cNvPicPr>
                       <a:picLocks noChangeAspect="1" noChangeArrowheads="1"/>
                     </pic:cNvPicPr>
@@ -453,7 +513,7 @@
                   <pic:spPr bwMode="auto">
                     <a:xfrm>
                       <a:off x="0" y="0"/>
-                      <a:ext cx="2721376" cy="2737290"/>
+                      <a:ext cx="4018376" cy="1971515"/>
                     </a:xfrm>
                     <a:prstGeom prst="rect">
                       <a:avLst/>
@@ -469,15 +529,27 @@
           </wp:inline>
         </w:drawing>
       </w:r>
+    </w:p>
+    <w:p>
+      <w:pPr>
+        <w:pStyle w:val="Prrafodelista"/>
+        <w:rPr>
+          <w:rFonts w:ascii="Consolas" w:hAnsi="Consolas"/>
+          <w:b/>
+          <w:bCs/>
+          <w:sz w:val="24"/>
+          <w:szCs w:val="24"/>
+        </w:rPr>
+      </w:pPr>
       <w:r>
         <w:rPr>
           <w:noProof/>
         </w:rPr>
         <w:drawing>
-          <wp:inline distT="0" distB="0" distL="0" distR="0" wp14:anchorId="662CC457" wp14:editId="5E753A22">
-            <wp:extent cx="3253740" cy="2541601"/>
-            <wp:effectExtent l="0" t="0" r="3810" b="0"/>
-            <wp:docPr id="4" name="Imagen 4"/>
+          <wp:inline distT="0" distB="0" distL="0" distR="0" wp14:anchorId="15EEBAA7" wp14:editId="16E97853">
+            <wp:extent cx="2514600" cy="1964235"/>
+            <wp:effectExtent l="0" t="0" r="0" b="0"/>
+            <wp:docPr id="1" name="Imagen 1"/>
             <wp:cNvGraphicFramePr>
               <a:graphicFrameLocks xmlns:a="http://schemas.openxmlformats.org/drawingml/2006/main" noChangeAspect="1"/>
             </wp:cNvGraphicFramePr>
@@ -485,7 +557,7 @@
               <a:graphicData uri="http://schemas.openxmlformats.org/drawingml/2006/picture">
                 <pic:pic xmlns:pic="http://schemas.openxmlformats.org/drawingml/2006/picture">
                   <pic:nvPicPr>
-                    <pic:cNvPr id="0" name="Picture 7"/>
+                    <pic:cNvPr id="0" name="Picture 2"/>
                     <pic:cNvPicPr>
                       <a:picLocks noChangeAspect="1" noChangeArrowheads="1"/>
                     </pic:cNvPicPr>
@@ -506,7 +578,7 @@
                   <pic:spPr bwMode="auto">
                     <a:xfrm>
                       <a:off x="0" y="0"/>
-                      <a:ext cx="3262882" cy="2548742"/>
+                      <a:ext cx="2521126" cy="1969332"/>
                     </a:xfrm>
                     <a:prstGeom prst="rect">
                       <a:avLst/>
@@ -525,6 +597,90 @@
     </w:p>
     <w:p>
       <w:pPr>
+        <w:pStyle w:val="Prrafodelista"/>
+        <w:rPr>
+          <w:rFonts w:ascii="Consolas" w:hAnsi="Consolas"/>
+          <w:b/>
+          <w:bCs/>
+          <w:sz w:val="24"/>
+          <w:szCs w:val="24"/>
+        </w:rPr>
+      </w:pPr>
+    </w:p>
+    <w:p>
+      <w:pPr>
+        <w:pStyle w:val="Prrafodelista"/>
+        <w:rPr>
+          <w:rFonts w:ascii="Consolas" w:hAnsi="Consolas"/>
+          <w:b/>
+          <w:bCs/>
+          <w:sz w:val="24"/>
+          <w:szCs w:val="24"/>
+        </w:rPr>
+      </w:pPr>
+    </w:p>
+    <w:p>
+      <w:pPr>
+        <w:pStyle w:val="Prrafodelista"/>
+        <w:rPr>
+          <w:rFonts w:ascii="Consolas" w:hAnsi="Consolas"/>
+          <w:b/>
+          <w:bCs/>
+          <w:sz w:val="24"/>
+          <w:szCs w:val="24"/>
+        </w:rPr>
+      </w:pPr>
+    </w:p>
+    <w:p>
+      <w:pPr>
+        <w:pStyle w:val="Prrafodelista"/>
+        <w:rPr>
+          <w:rFonts w:ascii="Consolas" w:hAnsi="Consolas"/>
+          <w:b/>
+          <w:bCs/>
+          <w:sz w:val="24"/>
+          <w:szCs w:val="24"/>
+        </w:rPr>
+      </w:pPr>
+    </w:p>
+    <w:p>
+      <w:pPr>
+        <w:pStyle w:val="Prrafodelista"/>
+        <w:rPr>
+          <w:rFonts w:ascii="Consolas" w:hAnsi="Consolas"/>
+          <w:b/>
+          <w:bCs/>
+          <w:sz w:val="24"/>
+          <w:szCs w:val="24"/>
+        </w:rPr>
+      </w:pPr>
+    </w:p>
+    <w:p>
+      <w:pPr>
+        <w:pStyle w:val="Prrafodelista"/>
+        <w:rPr>
+          <w:rFonts w:ascii="Consolas" w:hAnsi="Consolas"/>
+          <w:b/>
+          <w:bCs/>
+          <w:sz w:val="24"/>
+          <w:szCs w:val="24"/>
+        </w:rPr>
+      </w:pPr>
+    </w:p>
+    <w:p>
+      <w:pPr>
+        <w:pStyle w:val="Prrafodelista"/>
+        <w:rPr>
+          <w:rFonts w:ascii="Consolas" w:hAnsi="Consolas"/>
+          <w:b/>
+          <w:bCs/>
+          <w:sz w:val="24"/>
+          <w:szCs w:val="24"/>
+        </w:rPr>
+      </w:pPr>
+    </w:p>
+    <w:p>
+      <w:pPr>
         <w:rPr>
           <w:rFonts w:ascii="Consolas" w:hAnsi="Consolas"/>
           <w:b/>
@@ -557,6 +713,7 @@
           <w:sz w:val="24"/>
           <w:szCs w:val="24"/>
         </w:rPr>
+        <w:lastRenderedPageBreak/>
         <w:t>VISTA 2</w:t>
       </w:r>
     </w:p>
@@ -743,7 +900,6 @@
         <w:rPr>
           <w:noProof/>
         </w:rPr>
-        <w:lastRenderedPageBreak/>
         <w:drawing>
           <wp:inline distT="0" distB="0" distL="0" distR="0" wp14:anchorId="52442635" wp14:editId="1B7AA2C3">
             <wp:extent cx="4423410" cy="2103120"/>
@@ -793,112 +949,6 @@
           </wp:inline>
         </w:drawing>
       </w:r>
-      <w:r>
-        <w:rPr>
-          <w:noProof/>
-        </w:rPr>
-        <w:drawing>
-          <wp:inline distT="0" distB="0" distL="0" distR="0" wp14:anchorId="4AC2CEB5" wp14:editId="2E80D49D">
-            <wp:extent cx="4525771" cy="2750820"/>
-            <wp:effectExtent l="0" t="0" r="8255" b="0"/>
-            <wp:docPr id="6" name="Imagen 6"/>
-            <wp:cNvGraphicFramePr>
-              <a:graphicFrameLocks xmlns:a="http://schemas.openxmlformats.org/drawingml/2006/main" noChangeAspect="1"/>
-            </wp:cNvGraphicFramePr>
-            <a:graphic xmlns:a="http://schemas.openxmlformats.org/drawingml/2006/main">
-              <a:graphicData uri="http://schemas.openxmlformats.org/drawingml/2006/picture">
-                <pic:pic xmlns:pic="http://schemas.openxmlformats.org/drawingml/2006/picture">
-                  <pic:nvPicPr>
-                    <pic:cNvPr id="0" name="Picture 11"/>
-                    <pic:cNvPicPr>
-                      <a:picLocks noChangeAspect="1" noChangeArrowheads="1"/>
-                    </pic:cNvPicPr>
-                  </pic:nvPicPr>
-                  <pic:blipFill>
-                    <a:blip r:embed="rId10">
-                      <a:extLst>
-                        <a:ext uri="{28A0092B-C50C-407E-A947-70E740481C1C}">
-                          <a14:useLocalDpi xmlns:a14="http://schemas.microsoft.com/office/drawing/2010/main" val="0"/>
-                        </a:ext>
-                      </a:extLst>
-                    </a:blip>
-                    <a:srcRect/>
-                    <a:stretch>
-                      <a:fillRect/>
-                    </a:stretch>
-                  </pic:blipFill>
-                  <pic:spPr bwMode="auto">
-                    <a:xfrm>
-                      <a:off x="0" y="0"/>
-                      <a:ext cx="4527051" cy="2751598"/>
-                    </a:xfrm>
-                    <a:prstGeom prst="rect">
-                      <a:avLst/>
-                    </a:prstGeom>
-                    <a:noFill/>
-                    <a:ln>
-                      <a:noFill/>
-                    </a:ln>
-                  </pic:spPr>
-                </pic:pic>
-              </a:graphicData>
-            </a:graphic>
-          </wp:inline>
-        </w:drawing>
-      </w:r>
-      <w:r>
-        <w:rPr>
-          <w:noProof/>
-        </w:rPr>
-        <w:drawing>
-          <wp:inline distT="0" distB="0" distL="0" distR="0" wp14:anchorId="1F69633A" wp14:editId="291079E5">
-            <wp:extent cx="2019300" cy="1577340"/>
-            <wp:effectExtent l="0" t="0" r="0" b="3810"/>
-            <wp:docPr id="7" name="Imagen 7"/>
-            <wp:cNvGraphicFramePr>
-              <a:graphicFrameLocks xmlns:a="http://schemas.openxmlformats.org/drawingml/2006/main" noChangeAspect="1"/>
-            </wp:cNvGraphicFramePr>
-            <a:graphic xmlns:a="http://schemas.openxmlformats.org/drawingml/2006/main">
-              <a:graphicData uri="http://schemas.openxmlformats.org/drawingml/2006/picture">
-                <pic:pic xmlns:pic="http://schemas.openxmlformats.org/drawingml/2006/picture">
-                  <pic:nvPicPr>
-                    <pic:cNvPr id="0" name="Picture 13"/>
-                    <pic:cNvPicPr>
-                      <a:picLocks noChangeAspect="1" noChangeArrowheads="1"/>
-                    </pic:cNvPicPr>
-                  </pic:nvPicPr>
-                  <pic:blipFill>
-                    <a:blip r:embed="rId8">
-                      <a:extLst>
-                        <a:ext uri="{28A0092B-C50C-407E-A947-70E740481C1C}">
-                          <a14:useLocalDpi xmlns:a14="http://schemas.microsoft.com/office/drawing/2010/main" val="0"/>
-                        </a:ext>
-                      </a:extLst>
-                    </a:blip>
-                    <a:srcRect/>
-                    <a:stretch>
-                      <a:fillRect/>
-                    </a:stretch>
-                  </pic:blipFill>
-                  <pic:spPr bwMode="auto">
-                    <a:xfrm>
-                      <a:off x="0" y="0"/>
-                      <a:ext cx="2019300" cy="1577340"/>
-                    </a:xfrm>
-                    <a:prstGeom prst="rect">
-                      <a:avLst/>
-                    </a:prstGeom>
-                    <a:noFill/>
-                    <a:ln>
-                      <a:noFill/>
-                    </a:ln>
-                  </pic:spPr>
-                </pic:pic>
-              </a:graphicData>
-            </a:graphic>
-          </wp:inline>
-        </w:drawing>
-      </w:r>
     </w:p>
     <w:p>
       <w:pPr>
@@ -933,7 +983,7 @@
                     </pic:cNvPicPr>
                   </pic:nvPicPr>
                   <pic:blipFill>
-                    <a:blip r:embed="rId11">
+                    <a:blip r:embed="rId10">
                       <a:extLst>
                         <a:ext uri="{28A0092B-C50C-407E-A947-70E740481C1C}">
                           <a14:useLocalDpi xmlns:a14="http://schemas.microsoft.com/office/drawing/2010/main" val="0"/>
@@ -964,6 +1014,59 @@
           </wp:inline>
         </w:drawing>
       </w:r>
+      <w:r>
+        <w:rPr>
+          <w:noProof/>
+        </w:rPr>
+        <w:drawing>
+          <wp:inline distT="0" distB="0" distL="0" distR="0" wp14:anchorId="1D394720" wp14:editId="426FDC03">
+            <wp:extent cx="1950720" cy="2926080"/>
+            <wp:effectExtent l="0" t="0" r="0" b="7620"/>
+            <wp:docPr id="24" name="Imagen 24"/>
+            <wp:cNvGraphicFramePr>
+              <a:graphicFrameLocks xmlns:a="http://schemas.openxmlformats.org/drawingml/2006/main" noChangeAspect="1"/>
+            </wp:cNvGraphicFramePr>
+            <a:graphic xmlns:a="http://schemas.openxmlformats.org/drawingml/2006/main">
+              <a:graphicData uri="http://schemas.openxmlformats.org/drawingml/2006/picture">
+                <pic:pic xmlns:pic="http://schemas.openxmlformats.org/drawingml/2006/picture">
+                  <pic:nvPicPr>
+                    <pic:cNvPr id="0" name="Picture 8"/>
+                    <pic:cNvPicPr>
+                      <a:picLocks noChangeAspect="1" noChangeArrowheads="1"/>
+                    </pic:cNvPicPr>
+                  </pic:nvPicPr>
+                  <pic:blipFill>
+                    <a:blip r:embed="rId11" cstate="print">
+                      <a:extLst>
+                        <a:ext uri="{28A0092B-C50C-407E-A947-70E740481C1C}">
+                          <a14:useLocalDpi xmlns:a14="http://schemas.microsoft.com/office/drawing/2010/main" val="0"/>
+                        </a:ext>
+                      </a:extLst>
+                    </a:blip>
+                    <a:srcRect/>
+                    <a:stretch>
+                      <a:fillRect/>
+                    </a:stretch>
+                  </pic:blipFill>
+                  <pic:spPr bwMode="auto">
+                    <a:xfrm>
+                      <a:off x="0" y="0"/>
+                      <a:ext cx="1950720" cy="2926080"/>
+                    </a:xfrm>
+                    <a:prstGeom prst="rect">
+                      <a:avLst/>
+                    </a:prstGeom>
+                    <a:noFill/>
+                    <a:ln>
+                      <a:noFill/>
+                    </a:ln>
+                  </pic:spPr>
+                </pic:pic>
+              </a:graphicData>
+            </a:graphic>
+          </wp:inline>
+        </w:drawing>
+      </w:r>
     </w:p>
     <w:p>
       <w:pPr>
@@ -1036,7 +1139,6 @@
           <w:sz w:val="24"/>
           <w:szCs w:val="24"/>
         </w:rPr>
-        <w:lastRenderedPageBreak/>
         <w:t xml:space="preserve"> COMPONENTES AGENTE INTELIGENTE</w:t>
       </w:r>
     </w:p>
@@ -1402,10 +1504,7 @@
                         <w:txbxContent>
                           <w:p>
                             <w:r>
-                              <w:t>Aumentar</w:t>
-                            </w:r>
-                            <w:r>
-                              <w:t xml:space="preserve"> proyectiles</w:t>
+                              <w:t>Aumentar proyectiles</w:t>
                             </w:r>
                           </w:p>
                         </w:txbxContent>
@@ -1432,10 +1531,7 @@
                   <w:txbxContent>
                     <w:p>
                       <w:r>
-                        <w:t>Aumentar</w:t>
-                      </w:r>
-                      <w:r>
-                        <w:t xml:space="preserve"> proyectiles</w:t>
+                        <w:t>Aumentar proyectiles</w:t>
                       </w:r>
                     </w:p>
                   </w:txbxContent>
@@ -1946,13 +2042,7 @@
                         <w:txbxContent>
                           <w:p>
                             <w:r>
-                              <w:t>¿</w:t>
-                            </w:r>
-                            <w:r>
-                              <w:t>está cerca</w:t>
-                            </w:r>
-                            <w:r>
-                              <w:t>?</w:t>
+                              <w:t>¿está cerca?</w:t>
                             </w:r>
                           </w:p>
                         </w:txbxContent>
@@ -1979,13 +2069,7 @@
                   <w:txbxContent>
                     <w:p>
                       <w:r>
-                        <w:t>¿</w:t>
-                      </w:r>
-                      <w:r>
-                        <w:t>está cerca</w:t>
-                      </w:r>
-                      <w:r>
-                        <w:t>?</w:t>
+                        <w:t>¿está cerca?</w:t>
                       </w:r>
                     </w:p>
                   </w:txbxContent>
@@ -2131,10 +2215,7 @@
                         <w:txbxContent>
                           <w:p>
                             <w:r>
-                              <w:t>Aumentar</w:t>
-                            </w:r>
-                            <w:r>
-                              <w:t xml:space="preserve"> proyectiles</w:t>
+                              <w:t>Aumentar proyectiles</w:t>
                             </w:r>
                           </w:p>
                         </w:txbxContent>
@@ -2161,10 +2242,7 @@
                   <w:txbxContent>
                     <w:p>
                       <w:r>
-                        <w:t>Aumentar</w:t>
-                      </w:r>
-                      <w:r>
-                        <w:t xml:space="preserve"> proyectiles</w:t>
+                        <w:t>Aumentar proyectiles</w:t>
                       </w:r>
                     </w:p>
                   </w:txbxContent>
@@ -2844,10 +2922,7 @@
                         <w:txbxContent>
                           <w:p>
                             <w:r>
-                              <w:t xml:space="preserve">Analizar </w:t>
-                            </w:r>
-                            <w:r>
-                              <w:t>distancia a la meta</w:t>
+                              <w:t>Analizar distancia a la meta</w:t>
                             </w:r>
                           </w:p>
                         </w:txbxContent>
@@ -2874,10 +2949,7 @@
                   <w:txbxContent>
                     <w:p>
                       <w:r>
-                        <w:t xml:space="preserve">Analizar </w:t>
-                      </w:r>
-                      <w:r>
-                        <w:t>distancia a la meta</w:t>
+                        <w:t>Analizar distancia a la meta</w:t>
                       </w:r>
                     </w:p>
                   </w:txbxContent>
@@ -3160,7 +3232,7 @@
         <v:path o:extrusionok="f" gradientshapeok="t" o:connecttype="rect"/>
         <o:lock v:ext="edit" aspectratio="t"/>
       </v:shapetype>
-      <v:shape id="_x0000_i1055" type="#_x0000_t75" style="width:12.6pt;height:33.6pt;visibility:visible;mso-wrap-style:square" o:bullet="t">
+      <v:shape id="_x0000_i1075" type="#_x0000_t75" style="width:12.6pt;height:33.6pt;visibility:visible;mso-wrap-style:square" o:bullet="t">
         <v:imagedata r:id="rId1" o:title=""/>
       </v:shape>
     </w:pict>

</xml_diff>